<commit_message>
Update Milestone 3 report, remove build script
Made-with: Cursor
</commit_message>
<xml_diff>
--- a/Result/Milestone3_HeritageLens_BijayDhungana.docx
+++ b/Result/Milestone3_HeritageLens_BijayDhungana.docx
@@ -96,9 +96,9 @@
         <w:tblLook w:val="04A0" w:firstRow="1" w:lastRow="0" w:firstColumn="1" w:lastColumn="0" w:noHBand="0" w:noVBand="1"/>
       </w:tblPr>
       <w:tblGrid>
-        <w:gridCol w:w="3120"/>
-        <w:gridCol w:w="3168"/>
-        <w:gridCol w:w="3168"/>
+        <w:gridCol w:w="3085"/>
+        <w:gridCol w:w="3136"/>
+        <w:gridCol w:w="3129"/>
       </w:tblGrid>
       <w:tr>
         <w:trPr>
@@ -408,8 +408,8 @@
         <w:tblLook w:val="04A0" w:firstRow="1" w:lastRow="0" w:firstColumn="1" w:lastColumn="0" w:noHBand="0" w:noVBand="1"/>
       </w:tblPr>
       <w:tblGrid>
-        <w:gridCol w:w="4680"/>
-        <w:gridCol w:w="4680"/>
+        <w:gridCol w:w="4675"/>
+        <w:gridCol w:w="4675"/>
       </w:tblGrid>
       <w:tr>
         <w:trPr>
@@ -705,9 +705,9 @@
         <w:tblLook w:val="04A0" w:firstRow="1" w:lastRow="0" w:firstColumn="1" w:lastColumn="0" w:noHBand="0" w:noVBand="1"/>
       </w:tblPr>
       <w:tblGrid>
-        <w:gridCol w:w="3120"/>
-        <w:gridCol w:w="3120"/>
-        <w:gridCol w:w="3120"/>
+        <w:gridCol w:w="3117"/>
+        <w:gridCol w:w="3116"/>
+        <w:gridCol w:w="3117"/>
       </w:tblGrid>
       <w:tr>
         <w:trPr>
@@ -1112,8 +1112,8 @@
         <w:tblLook w:val="04A0" w:firstRow="1" w:lastRow="0" w:firstColumn="1" w:lastColumn="0" w:noHBand="0" w:noVBand="1"/>
       </w:tblPr>
       <w:tblGrid>
-        <w:gridCol w:w="4680"/>
-        <w:gridCol w:w="4680"/>
+        <w:gridCol w:w="4675"/>
+        <w:gridCol w:w="4675"/>
       </w:tblGrid>
       <w:tr>
         <w:trPr>
@@ -1547,11 +1547,11 @@
         <w:tblLook w:val="04A0" w:firstRow="1" w:lastRow="0" w:firstColumn="1" w:lastColumn="0" w:noHBand="0" w:noVBand="1"/>
       </w:tblPr>
       <w:tblGrid>
-        <w:gridCol w:w="1872"/>
-        <w:gridCol w:w="1872"/>
-        <w:gridCol w:w="1872"/>
-        <w:gridCol w:w="1872"/>
-        <w:gridCol w:w="1872"/>
+        <w:gridCol w:w="1870"/>
+        <w:gridCol w:w="1869"/>
+        <w:gridCol w:w="1870"/>
+        <w:gridCol w:w="1870"/>
+        <w:gridCol w:w="1871"/>
       </w:tblGrid>
       <w:tr>
         <w:trPr>
@@ -2209,8 +2209,8 @@
         <w:tblLook w:val="04A0" w:firstRow="1" w:lastRow="0" w:firstColumn="1" w:lastColumn="0" w:noHBand="0" w:noVBand="1"/>
       </w:tblPr>
       <w:tblGrid>
-        <w:gridCol w:w="4680"/>
-        <w:gridCol w:w="4680"/>
+        <w:gridCol w:w="4675"/>
+        <w:gridCol w:w="4675"/>
       </w:tblGrid>
       <w:tr>
         <w:trPr>
@@ -2451,10 +2451,10 @@
         </w:rPr>
         <w:lastRenderedPageBreak/>
         <w:drawing>
-          <wp:inline distT="0" distB="0" distL="0" distR="0" wp14:anchorId="645939A7" wp14:editId="4E05B188">
-            <wp:extent cx="3657600" cy="4594485"/>
+          <wp:inline distT="0" distB="0" distL="0" distR="0" wp14:anchorId="619E9EF1" wp14:editId="4611668F">
+            <wp:extent cx="2800489" cy="4181231"/>
             <wp:effectExtent l="0" t="0" r="0" b="0"/>
-            <wp:docPr id="3" name="Picture 3"/>
+            <wp:docPr id="92627124" name="Picture 1" descr="A statue of a person with flowers around it&#10;&#10;AI-generated content may be incorrect."/>
             <wp:cNvGraphicFramePr>
               <a:graphicFrameLocks xmlns:a="http://schemas.openxmlformats.org/drawingml/2006/main" noChangeAspect="1"/>
             </wp:cNvGraphicFramePr>
@@ -2462,7 +2462,7 @@
               <a:graphicData uri="http://schemas.openxmlformats.org/drawingml/2006/picture">
                 <pic:pic xmlns:pic="http://schemas.openxmlformats.org/drawingml/2006/picture">
                   <pic:nvPicPr>
-                    <pic:cNvPr id="0" name="comparisionofcaption.png"/>
+                    <pic:cNvPr id="92627124" name="Picture 1" descr="A statue of a person with flowers around it&#10;&#10;AI-generated content may be incorrect."/>
                     <pic:cNvPicPr/>
                   </pic:nvPicPr>
                   <pic:blipFill>
@@ -2474,7 +2474,47 @@
                   <pic:spPr>
                     <a:xfrm>
                       <a:off x="0" y="0"/>
-                      <a:ext cx="3657600" cy="4594485"/>
+                      <a:ext cx="2820360" cy="4210899"/>
+                    </a:xfrm>
+                    <a:prstGeom prst="rect">
+                      <a:avLst/>
+                    </a:prstGeom>
+                  </pic:spPr>
+                </pic:pic>
+              </a:graphicData>
+            </a:graphic>
+          </wp:inline>
+        </w:drawing>
+      </w:r>
+      <w:r>
+        <w:rPr>
+          <w:noProof/>
+        </w:rPr>
+        <w:drawing>
+          <wp:inline distT="0" distB="0" distL="0" distR="0" wp14:anchorId="55AA7E2D" wp14:editId="2792DB8C">
+            <wp:extent cx="2024185" cy="1656715"/>
+            <wp:effectExtent l="0" t="0" r="0" b="0"/>
+            <wp:docPr id="1766966534" name="Picture 2" descr="A close-up of a text&#10;&#10;AI-generated content may be incorrect."/>
+            <wp:cNvGraphicFramePr>
+              <a:graphicFrameLocks xmlns:a="http://schemas.openxmlformats.org/drawingml/2006/main" noChangeAspect="1"/>
+            </wp:cNvGraphicFramePr>
+            <a:graphic xmlns:a="http://schemas.openxmlformats.org/drawingml/2006/main">
+              <a:graphicData uri="http://schemas.openxmlformats.org/drawingml/2006/picture">
+                <pic:pic xmlns:pic="http://schemas.openxmlformats.org/drawingml/2006/picture">
+                  <pic:nvPicPr>
+                    <pic:cNvPr id="1766966534" name="Picture 2" descr="A close-up of a text&#10;&#10;AI-generated content may be incorrect."/>
+                    <pic:cNvPicPr/>
+                  </pic:nvPicPr>
+                  <pic:blipFill>
+                    <a:blip r:embed="rId9"/>
+                    <a:stretch>
+                      <a:fillRect/>
+                    </a:stretch>
+                  </pic:blipFill>
+                  <pic:spPr>
+                    <a:xfrm>
+                      <a:off x="0" y="0"/>
+                      <a:ext cx="2068559" cy="1693033"/>
                     </a:xfrm>
                     <a:prstGeom prst="rect">
                       <a:avLst/>
@@ -2526,7 +2566,7 @@
                     <pic:cNvPicPr/>
                   </pic:nvPicPr>
                   <pic:blipFill>
-                    <a:blip r:embed="rId9"/>
+                    <a:blip r:embed="rId10"/>
                     <a:stretch>
                       <a:fillRect/>
                     </a:stretch>

</xml_diff>